<commit_message>
feat: add bab 5 & 6
</commit_message>
<xml_diff>
--- a/Cover.docx
+++ b/Cover.docx
@@ -1,6 +1,6 @@
 
 <file path=word/document.xml><?xml version="1.0" encoding="utf-8"?>
-<w:document xmlns:wpc="http://schemas.microsoft.com/office/word/2010/wordprocessingCanvas" xmlns:cx="http://schemas.microsoft.com/office/drawing/2014/chartex" xmlns:cx1="http://schemas.microsoft.com/office/drawing/2015/9/8/chartex" xmlns:cx2="http://schemas.microsoft.com/office/drawing/2015/10/21/chartex" xmlns:cx3="http://schemas.microsoft.com/office/drawing/2016/5/9/chartex" xmlns:cx4="http://schemas.microsoft.com/office/drawing/2016/5/10/chartex" xmlns:cx5="http://schemas.microsoft.com/office/drawing/2016/5/11/chartex" xmlns:cx6="http://schemas.microsoft.com/office/drawing/2016/5/12/chartex" xmlns:cx7="http://schemas.microsoft.com/office/drawing/2016/5/13/chartex" xmlns:cx8="http://schemas.microsoft.com/office/drawing/2016/5/14/chartex" xmlns:mc="http://schemas.openxmlformats.org/markup-compatibility/2006" xmlns:aink="http://schemas.microsoft.com/office/drawing/2016/ink" xmlns:am3d="http://schemas.microsoft.com/office/drawing/2017/model3d" xmlns:o="urn:schemas-microsoft-com:office:office" xmlns:oel="http://schemas.microsoft.com/office/2019/extlst" xmlns:r="http://schemas.openxmlformats.org/officeDocument/2006/relationships" xmlns:m="http://schemas.openxmlformats.org/officeDocument/2006/math" xmlns:v="urn:schemas-microsoft-com:vml" xmlns:wp14="http://schemas.microsoft.com/office/word/2010/wordprocessingDrawing" xmlns:wp="http://schemas.openxmlformats.org/drawingml/2006/wordprocessingDrawing" xmlns:w10="urn:schemas-microsoft-com:office:word" xmlns:w="http://schemas.openxmlformats.org/wordprocessingml/2006/main" xmlns:w14="http://schemas.microsoft.com/office/word/2010/wordml" xmlns:w15="http://schemas.microsoft.com/office/word/2012/wordml" xmlns:w16cex="http://schemas.microsoft.com/office/word/2018/wordml/cex" xmlns:w16cid="http://schemas.microsoft.com/office/word/2016/wordml/cid" xmlns:w16="http://schemas.microsoft.com/office/word/2018/wordml" xmlns:w16du="http://schemas.microsoft.com/office/word/2023/wordml/word16du" xmlns:w16sdtdh="http://schemas.microsoft.com/office/word/2020/wordml/sdtdatahash" xmlns:w16sdtfl="http://schemas.microsoft.com/office/word/2024/wordml/sdtformatlock" xmlns:w16se="http://schemas.microsoft.com/office/word/2015/wordml/symex" xmlns:wpg="http://schemas.microsoft.com/office/word/2010/wordprocessingGroup" xmlns:wpi="http://schemas.microsoft.com/office/word/2010/wordprocessingInk" xmlns:wne="http://schemas.microsoft.com/office/word/2006/wordml" xmlns:wps="http://schemas.microsoft.com/office/word/2010/wordprocessingShape" mc:Ignorable="w14 w15 w16se w16cid w16 w16cex w16sdtdh w16sdtfl w16du wp14">
+<w:document xmlns:wpc="http://schemas.microsoft.com/office/word/2010/wordprocessingCanvas" xmlns:cx="http://schemas.microsoft.com/office/drawing/2014/chartex" xmlns:cx1="http://schemas.microsoft.com/office/drawing/2015/9/8/chartex" xmlns:cx2="http://schemas.microsoft.com/office/drawing/2015/10/21/chartex" xmlns:cx3="http://schemas.microsoft.com/office/drawing/2016/5/9/chartex" xmlns:cx4="http://schemas.microsoft.com/office/drawing/2016/5/10/chartex" xmlns:cx5="http://schemas.microsoft.com/office/drawing/2016/5/11/chartex" xmlns:cx6="http://schemas.microsoft.com/office/drawing/2016/5/12/chartex" xmlns:cx7="http://schemas.microsoft.com/office/drawing/2016/5/13/chartex" xmlns:cx8="http://schemas.microsoft.com/office/drawing/2016/5/14/chartex" xmlns:mc="http://schemas.openxmlformats.org/markup-compatibility/2006" xmlns:m="http://schemas.openxmlformats.org/officeDocument/2006/math" xmlns:aink="http://schemas.microsoft.com/office/drawing/2016/ink" xmlns:am3d="http://schemas.microsoft.com/office/drawing/2017/model3d" xmlns:oel="http://schemas.microsoft.com/office/2019/extlst" xmlns:r="http://schemas.openxmlformats.org/officeDocument/2006/relationships" xmlns:wp14="http://schemas.microsoft.com/office/word/2010/wordprocessingDrawing" xmlns:wp="http://schemas.openxmlformats.org/drawingml/2006/wordprocessingDrawing" xmlns:wpg="http://schemas.microsoft.com/office/word/2010/wordprocessingGroup" xmlns:wpi="http://schemas.microsoft.com/office/word/2010/wordprocessingInk" xmlns:wps="http://schemas.microsoft.com/office/word/2010/wordprocessingShape" xmlns:o="urn:schemas-microsoft-com:office:office" xmlns:v="urn:schemas-microsoft-com:vml" xmlns:w10="urn:schemas-microsoft-com:office:word" xmlns:w="http://schemas.openxmlformats.org/wordprocessingml/2006/main" xmlns:w14="http://schemas.microsoft.com/office/word/2010/wordml" xmlns:w15="http://schemas.microsoft.com/office/word/2012/wordml" xmlns:w16cei="http://schemas.microsoft.com/office/word/2026/wordml/cei" xmlns:w16cex="http://schemas.microsoft.com/office/word/2018/wordml/cex" xmlns:w16cid="http://schemas.microsoft.com/office/word/2016/wordml/cid" xmlns:w16="http://schemas.microsoft.com/office/word/2018/wordml" xmlns:w16sdtdh="http://schemas.microsoft.com/office/word/2020/wordml/sdtdatahash" xmlns:w16sdtfl="http://schemas.microsoft.com/office/word/2024/wordml/sdtformatlock" xmlns:w16se="http://schemas.microsoft.com/office/word/2015/wordml/symex" xmlns:w16du="http://schemas.microsoft.com/office/word/2023/wordml/word16du" xmlns:wne="http://schemas.microsoft.com/office/word/2006/wordml" mc:Ignorable="w14 w15 w16se w16cid w16 w16cex w16sdtdh w16sdtfl w16du wp14">
   <w:body>
     <w:p>
       <w:pPr>
@@ -9,7 +9,7 @@
           <w:ilvl w:val="0"/>
           <w:numId w:val="0"/>
         </w:numPr>
-        <w:spacing w:before="1" w:line="276" w:lineRule="auto"/>
+        <w:spacing w:before="1" w:line="240" w:lineRule="auto"/>
         <w:jc w:val="center"/>
         <w:rPr>
           <w:b w:val="0"/>
@@ -164,7 +164,8 @@
           <w:b w:val="0"/>
           <w:bCs/>
           <w:color w:val="000000" w:themeColor="text1"/>
-          <w:szCs w:val="28"/>
+          <w:sz w:val="32"/>
+          <w:szCs w:val="32"/>
         </w:rPr>
       </w:pPr>
       <w:r>
@@ -172,7 +173,8 @@
           <w:bCs/>
           <w:color w:val="000000" w:themeColor="text1"/>
           <w:spacing w:val="-2"/>
-          <w:szCs w:val="28"/>
+          <w:sz w:val="32"/>
+          <w:szCs w:val="32"/>
         </w:rPr>
         <w:t>SKRIPSI</w:t>
       </w:r>
@@ -180,126 +182,71 @@
     <w:p>
       <w:pPr>
         <w:pStyle w:val="BodyText"/>
-        <w:spacing w:line="276" w:lineRule="auto"/>
+        <w:spacing w:line="360" w:lineRule="auto"/>
         <w:jc w:val="center"/>
-        <w:rPr>
-          <w:i/>
-          <w:iCs/>
-        </w:rPr>
       </w:pPr>
       <w:r>
-        <w:rPr>
-          <w:i/>
-          <w:iCs/>
-        </w:rPr>
         <w:t>Diajukan</w:t>
       </w:r>
       <w:r>
         <w:rPr>
-          <w:i/>
-          <w:iCs/>
           <w:spacing w:val="-7"/>
         </w:rPr>
         <w:t xml:space="preserve"> </w:t>
       </w:r>
       <w:r>
-        <w:rPr>
-          <w:i/>
-          <w:iCs/>
-        </w:rPr>
         <w:t>untuk</w:t>
       </w:r>
       <w:r>
         <w:rPr>
-          <w:i/>
-          <w:iCs/>
           <w:spacing w:val="-7"/>
         </w:rPr>
         <w:t xml:space="preserve"> </w:t>
       </w:r>
       <w:r>
-        <w:rPr>
-          <w:i/>
-          <w:iCs/>
-        </w:rPr>
         <w:t>Memenuhi</w:t>
       </w:r>
       <w:r>
         <w:rPr>
-          <w:i/>
-          <w:iCs/>
           <w:spacing w:val="-7"/>
         </w:rPr>
         <w:t xml:space="preserve"> </w:t>
       </w:r>
       <w:r>
-        <w:rPr>
-          <w:i/>
-          <w:iCs/>
-        </w:rPr>
         <w:t>Persyaratan</w:t>
       </w:r>
       <w:r>
         <w:rPr>
-          <w:i/>
-          <w:iCs/>
           <w:spacing w:val="-7"/>
         </w:rPr>
         <w:t xml:space="preserve"> </w:t>
       </w:r>
       <w:r>
-        <w:rPr>
-          <w:i/>
-          <w:iCs/>
-        </w:rPr>
         <w:t>Akademis</w:t>
       </w:r>
       <w:r>
         <w:rPr>
-          <w:i/>
-          <w:iCs/>
           <w:spacing w:val="-7"/>
         </w:rPr>
         <w:t xml:space="preserve"> </w:t>
       </w:r>
       <w:r>
-        <w:rPr>
-          <w:i/>
-          <w:iCs/>
-        </w:rPr>
         <w:t>dalam</w:t>
       </w:r>
       <w:r>
         <w:rPr>
-          <w:i/>
-          <w:iCs/>
           <w:spacing w:val="-7"/>
         </w:rPr>
         <w:t xml:space="preserve"> </w:t>
       </w:r>
       <w:r>
-        <w:rPr>
-          <w:i/>
-          <w:iCs/>
-        </w:rPr>
         <w:t>Menyelesaikan Program Sarjana Strata Satu pada Program Studi Teknik Informatika</w:t>
       </w:r>
     </w:p>
     <w:p>
       <w:pPr>
         <w:pStyle w:val="BodyText"/>
-        <w:spacing w:line="276" w:lineRule="auto"/>
-        <w:jc w:val="center"/>
-        <w:rPr>
-          <w:i/>
-          <w:iCs/>
-        </w:rPr>
-      </w:pPr>
-    </w:p>
-    <w:p>
-      <w:pPr>
-        <w:pStyle w:val="BodyText"/>
-        <w:spacing w:before="200" w:line="276" w:lineRule="auto"/>
+        <w:spacing w:line="360" w:lineRule="auto"/>
         <w:jc w:val="center"/>
       </w:pPr>
       <w:r>
@@ -315,12 +262,18 @@
     <w:p>
       <w:pPr>
         <w:pStyle w:val="BodyText"/>
-        <w:spacing w:before="124" w:line="276" w:lineRule="auto"/>
+        <w:spacing w:before="124" w:line="360" w:lineRule="auto"/>
       </w:pPr>
     </w:p>
     <w:p>
       <w:pPr>
-        <w:spacing w:line="276" w:lineRule="auto"/>
+        <w:pStyle w:val="BodyText"/>
+        <w:spacing w:before="124" w:line="360" w:lineRule="auto"/>
+      </w:pPr>
+    </w:p>
+    <w:p>
+      <w:pPr>
+        <w:spacing w:line="480" w:lineRule="auto"/>
         <w:jc w:val="center"/>
         <w:rPr>
           <w:b/>
@@ -353,7 +306,7 @@
     </w:p>
     <w:p>
       <w:pPr>
-        <w:spacing w:line="276" w:lineRule="auto"/>
+        <w:spacing w:line="480" w:lineRule="auto"/>
         <w:jc w:val="center"/>
         <w:rPr>
           <w:b/>
@@ -376,6 +329,16 @@
         </w:rPr>
         <w:t>(20221020009)</w:t>
       </w:r>
+    </w:p>
+    <w:p>
+      <w:pPr>
+        <w:pStyle w:val="BodyText"/>
+        <w:spacing w:before="0" w:line="276" w:lineRule="auto"/>
+        <w:rPr>
+          <w:b/>
+          <w:sz w:val="20"/>
+        </w:rPr>
+      </w:pPr>
     </w:p>
     <w:p>
       <w:pPr>
@@ -455,11 +418,6 @@
     <w:p>
       <w:pPr>
         <w:spacing w:line="276" w:lineRule="auto"/>
-      </w:pPr>
-    </w:p>
-    <w:p>
-      <w:pPr>
-        <w:spacing w:line="276" w:lineRule="auto"/>
         <w:jc w:val="center"/>
         <w:rPr>
           <w:b/>
@@ -562,12 +520,6 @@
         <w:t>2026</w:t>
       </w:r>
     </w:p>
-    <w:p>
-      <w:pPr>
-        <w:spacing w:after="0" w:line="480" w:lineRule="auto"/>
-        <w:ind w:left="567"/>
-      </w:pPr>
-    </w:p>
     <w:sectPr>
       <w:pgSz w:w="12240" w:h="15840"/>
       <w:pgMar w:top="1701" w:right="1701" w:bottom="1701" w:left="2268" w:header="720" w:footer="720" w:gutter="0"/>
@@ -578,7 +530,7 @@
 </file>
 
 <file path=word/endnotes.xml><?xml version="1.0" encoding="utf-8"?>
-<w:endnotes xmlns:wpc="http://schemas.microsoft.com/office/word/2010/wordprocessingCanvas" xmlns:cx="http://schemas.microsoft.com/office/drawing/2014/chartex" xmlns:cx1="http://schemas.microsoft.com/office/drawing/2015/9/8/chartex" xmlns:cx2="http://schemas.microsoft.com/office/drawing/2015/10/21/chartex" xmlns:cx3="http://schemas.microsoft.com/office/drawing/2016/5/9/chartex" xmlns:cx4="http://schemas.microsoft.com/office/drawing/2016/5/10/chartex" xmlns:cx5="http://schemas.microsoft.com/office/drawing/2016/5/11/chartex" xmlns:cx6="http://schemas.microsoft.com/office/drawing/2016/5/12/chartex" xmlns:cx7="http://schemas.microsoft.com/office/drawing/2016/5/13/chartex" xmlns:cx8="http://schemas.microsoft.com/office/drawing/2016/5/14/chartex" xmlns:mc="http://schemas.openxmlformats.org/markup-compatibility/2006" xmlns:aink="http://schemas.microsoft.com/office/drawing/2016/ink" xmlns:am3d="http://schemas.microsoft.com/office/drawing/2017/model3d" xmlns:o="urn:schemas-microsoft-com:office:office" xmlns:oel="http://schemas.microsoft.com/office/2019/extlst" xmlns:r="http://schemas.openxmlformats.org/officeDocument/2006/relationships" xmlns:m="http://schemas.openxmlformats.org/officeDocument/2006/math" xmlns:v="urn:schemas-microsoft-com:vml" xmlns:wp14="http://schemas.microsoft.com/office/word/2010/wordprocessingDrawing" xmlns:wp="http://schemas.openxmlformats.org/drawingml/2006/wordprocessingDrawing" xmlns:w10="urn:schemas-microsoft-com:office:word" xmlns:w="http://schemas.openxmlformats.org/wordprocessingml/2006/main" xmlns:w14="http://schemas.microsoft.com/office/word/2010/wordml" xmlns:w15="http://schemas.microsoft.com/office/word/2012/wordml" xmlns:w16cex="http://schemas.microsoft.com/office/word/2018/wordml/cex" xmlns:w16cid="http://schemas.microsoft.com/office/word/2016/wordml/cid" xmlns:w16="http://schemas.microsoft.com/office/word/2018/wordml" xmlns:w16du="http://schemas.microsoft.com/office/word/2023/wordml/word16du" xmlns:w16sdtdh="http://schemas.microsoft.com/office/word/2020/wordml/sdtdatahash" xmlns:w16sdtfl="http://schemas.microsoft.com/office/word/2024/wordml/sdtformatlock" xmlns:w16se="http://schemas.microsoft.com/office/word/2015/wordml/symex" xmlns:wpg="http://schemas.microsoft.com/office/word/2010/wordprocessingGroup" xmlns:wpi="http://schemas.microsoft.com/office/word/2010/wordprocessingInk" xmlns:wne="http://schemas.microsoft.com/office/word/2006/wordml" xmlns:wps="http://schemas.microsoft.com/office/word/2010/wordprocessingShape" mc:Ignorable="w14 w15 w16se w16cid w16 w16cex w16sdtdh w16sdtfl w16du wp14">
+<w:endnotes xmlns:wpc="http://schemas.microsoft.com/office/word/2010/wordprocessingCanvas" xmlns:cx="http://schemas.microsoft.com/office/drawing/2014/chartex" xmlns:cx1="http://schemas.microsoft.com/office/drawing/2015/9/8/chartex" xmlns:cx2="http://schemas.microsoft.com/office/drawing/2015/10/21/chartex" xmlns:cx3="http://schemas.microsoft.com/office/drawing/2016/5/9/chartex" xmlns:cx4="http://schemas.microsoft.com/office/drawing/2016/5/10/chartex" xmlns:cx5="http://schemas.microsoft.com/office/drawing/2016/5/11/chartex" xmlns:cx6="http://schemas.microsoft.com/office/drawing/2016/5/12/chartex" xmlns:cx7="http://schemas.microsoft.com/office/drawing/2016/5/13/chartex" xmlns:cx8="http://schemas.microsoft.com/office/drawing/2016/5/14/chartex" xmlns:mc="http://schemas.openxmlformats.org/markup-compatibility/2006" xmlns:m="http://schemas.openxmlformats.org/officeDocument/2006/math" xmlns:aink="http://schemas.microsoft.com/office/drawing/2016/ink" xmlns:am3d="http://schemas.microsoft.com/office/drawing/2017/model3d" xmlns:oel="http://schemas.microsoft.com/office/2019/extlst" xmlns:r="http://schemas.openxmlformats.org/officeDocument/2006/relationships" xmlns:wp14="http://schemas.microsoft.com/office/word/2010/wordprocessingDrawing" xmlns:wp="http://schemas.openxmlformats.org/drawingml/2006/wordprocessingDrawing" xmlns:wpg="http://schemas.microsoft.com/office/word/2010/wordprocessingGroup" xmlns:wpi="http://schemas.microsoft.com/office/word/2010/wordprocessingInk" xmlns:wps="http://schemas.microsoft.com/office/word/2010/wordprocessingShape" xmlns:o="urn:schemas-microsoft-com:office:office" xmlns:v="urn:schemas-microsoft-com:vml" xmlns:w10="urn:schemas-microsoft-com:office:word" xmlns:w="http://schemas.openxmlformats.org/wordprocessingml/2006/main" xmlns:w14="http://schemas.microsoft.com/office/word/2010/wordml" xmlns:w15="http://schemas.microsoft.com/office/word/2012/wordml" xmlns:w16cei="http://schemas.microsoft.com/office/word/2026/wordml/cei" xmlns:w16cex="http://schemas.microsoft.com/office/word/2018/wordml/cex" xmlns:w16cid="http://schemas.microsoft.com/office/word/2016/wordml/cid" xmlns:w16="http://schemas.microsoft.com/office/word/2018/wordml" xmlns:w16sdtdh="http://schemas.microsoft.com/office/word/2020/wordml/sdtdatahash" xmlns:w16sdtfl="http://schemas.microsoft.com/office/word/2024/wordml/sdtformatlock" xmlns:w16se="http://schemas.microsoft.com/office/word/2015/wordml/symex" xmlns:w16du="http://schemas.microsoft.com/office/word/2023/wordml/word16du" xmlns:wne="http://schemas.microsoft.com/office/word/2006/wordml" mc:Ignorable="w14 w15 w16se w16cid w16 w16cex w16sdtdh w16sdtfl w16du wp14">
   <w:endnote w:type="separator" w:id="-1">
     <w:p>
       <w:pPr>
@@ -603,7 +555,7 @@
 </file>
 
 <file path=word/footnotes.xml><?xml version="1.0" encoding="utf-8"?>
-<w:footnotes xmlns:wpc="http://schemas.microsoft.com/office/word/2010/wordprocessingCanvas" xmlns:cx="http://schemas.microsoft.com/office/drawing/2014/chartex" xmlns:cx1="http://schemas.microsoft.com/office/drawing/2015/9/8/chartex" xmlns:cx2="http://schemas.microsoft.com/office/drawing/2015/10/21/chartex" xmlns:cx3="http://schemas.microsoft.com/office/drawing/2016/5/9/chartex" xmlns:cx4="http://schemas.microsoft.com/office/drawing/2016/5/10/chartex" xmlns:cx5="http://schemas.microsoft.com/office/drawing/2016/5/11/chartex" xmlns:cx6="http://schemas.microsoft.com/office/drawing/2016/5/12/chartex" xmlns:cx7="http://schemas.microsoft.com/office/drawing/2016/5/13/chartex" xmlns:cx8="http://schemas.microsoft.com/office/drawing/2016/5/14/chartex" xmlns:mc="http://schemas.openxmlformats.org/markup-compatibility/2006" xmlns:aink="http://schemas.microsoft.com/office/drawing/2016/ink" xmlns:am3d="http://schemas.microsoft.com/office/drawing/2017/model3d" xmlns:o="urn:schemas-microsoft-com:office:office" xmlns:oel="http://schemas.microsoft.com/office/2019/extlst" xmlns:r="http://schemas.openxmlformats.org/officeDocument/2006/relationships" xmlns:m="http://schemas.openxmlformats.org/officeDocument/2006/math" xmlns:v="urn:schemas-microsoft-com:vml" xmlns:wp14="http://schemas.microsoft.com/office/word/2010/wordprocessingDrawing" xmlns:wp="http://schemas.openxmlformats.org/drawingml/2006/wordprocessingDrawing" xmlns:w10="urn:schemas-microsoft-com:office:word" xmlns:w="http://schemas.openxmlformats.org/wordprocessingml/2006/main" xmlns:w14="http://schemas.microsoft.com/office/word/2010/wordml" xmlns:w15="http://schemas.microsoft.com/office/word/2012/wordml" xmlns:w16cex="http://schemas.microsoft.com/office/word/2018/wordml/cex" xmlns:w16cid="http://schemas.microsoft.com/office/word/2016/wordml/cid" xmlns:w16="http://schemas.microsoft.com/office/word/2018/wordml" xmlns:w16du="http://schemas.microsoft.com/office/word/2023/wordml/word16du" xmlns:w16sdtdh="http://schemas.microsoft.com/office/word/2020/wordml/sdtdatahash" xmlns:w16sdtfl="http://schemas.microsoft.com/office/word/2024/wordml/sdtformatlock" xmlns:w16se="http://schemas.microsoft.com/office/word/2015/wordml/symex" xmlns:wpg="http://schemas.microsoft.com/office/word/2010/wordprocessingGroup" xmlns:wpi="http://schemas.microsoft.com/office/word/2010/wordprocessingInk" xmlns:wne="http://schemas.microsoft.com/office/word/2006/wordml" xmlns:wps="http://schemas.microsoft.com/office/word/2010/wordprocessingShape" mc:Ignorable="w14 w15 w16se w16cid w16 w16cex w16sdtdh w16sdtfl w16du wp14">
+<w:footnotes xmlns:wpc="http://schemas.microsoft.com/office/word/2010/wordprocessingCanvas" xmlns:cx="http://schemas.microsoft.com/office/drawing/2014/chartex" xmlns:cx1="http://schemas.microsoft.com/office/drawing/2015/9/8/chartex" xmlns:cx2="http://schemas.microsoft.com/office/drawing/2015/10/21/chartex" xmlns:cx3="http://schemas.microsoft.com/office/drawing/2016/5/9/chartex" xmlns:cx4="http://schemas.microsoft.com/office/drawing/2016/5/10/chartex" xmlns:cx5="http://schemas.microsoft.com/office/drawing/2016/5/11/chartex" xmlns:cx6="http://schemas.microsoft.com/office/drawing/2016/5/12/chartex" xmlns:cx7="http://schemas.microsoft.com/office/drawing/2016/5/13/chartex" xmlns:cx8="http://schemas.microsoft.com/office/drawing/2016/5/14/chartex" xmlns:mc="http://schemas.openxmlformats.org/markup-compatibility/2006" xmlns:m="http://schemas.openxmlformats.org/officeDocument/2006/math" xmlns:aink="http://schemas.microsoft.com/office/drawing/2016/ink" xmlns:am3d="http://schemas.microsoft.com/office/drawing/2017/model3d" xmlns:oel="http://schemas.microsoft.com/office/2019/extlst" xmlns:r="http://schemas.openxmlformats.org/officeDocument/2006/relationships" xmlns:wp14="http://schemas.microsoft.com/office/word/2010/wordprocessingDrawing" xmlns:wp="http://schemas.openxmlformats.org/drawingml/2006/wordprocessingDrawing" xmlns:wpg="http://schemas.microsoft.com/office/word/2010/wordprocessingGroup" xmlns:wpi="http://schemas.microsoft.com/office/word/2010/wordprocessingInk" xmlns:wps="http://schemas.microsoft.com/office/word/2010/wordprocessingShape" xmlns:o="urn:schemas-microsoft-com:office:office" xmlns:v="urn:schemas-microsoft-com:vml" xmlns:w10="urn:schemas-microsoft-com:office:word" xmlns:w="http://schemas.openxmlformats.org/wordprocessingml/2006/main" xmlns:w14="http://schemas.microsoft.com/office/word/2010/wordml" xmlns:w15="http://schemas.microsoft.com/office/word/2012/wordml" xmlns:w16cei="http://schemas.microsoft.com/office/word/2026/wordml/cei" xmlns:w16cex="http://schemas.microsoft.com/office/word/2018/wordml/cex" xmlns:w16cid="http://schemas.microsoft.com/office/word/2016/wordml/cid" xmlns:w16="http://schemas.microsoft.com/office/word/2018/wordml" xmlns:w16sdtdh="http://schemas.microsoft.com/office/word/2020/wordml/sdtdatahash" xmlns:w16sdtfl="http://schemas.microsoft.com/office/word/2024/wordml/sdtformatlock" xmlns:w16se="http://schemas.microsoft.com/office/word/2015/wordml/symex" xmlns:w16du="http://schemas.microsoft.com/office/word/2023/wordml/word16du" xmlns:wne="http://schemas.microsoft.com/office/word/2006/wordml" mc:Ignorable="w14 w15 w16se w16cid w16 w16cex w16sdtdh w16sdtfl w16du wp14">
   <w:footnote w:type="separator" w:id="-1">
     <w:p>
       <w:pPr>
@@ -628,7 +580,7 @@
 </file>
 
 <file path=word/numbering.xml><?xml version="1.0" encoding="utf-8"?>
-<w:numbering xmlns:wpc="http://schemas.microsoft.com/office/word/2010/wordprocessingCanvas" xmlns:cx="http://schemas.microsoft.com/office/drawing/2014/chartex" xmlns:cx1="http://schemas.microsoft.com/office/drawing/2015/9/8/chartex" xmlns:cx2="http://schemas.microsoft.com/office/drawing/2015/10/21/chartex" xmlns:cx3="http://schemas.microsoft.com/office/drawing/2016/5/9/chartex" xmlns:cx4="http://schemas.microsoft.com/office/drawing/2016/5/10/chartex" xmlns:cx5="http://schemas.microsoft.com/office/drawing/2016/5/11/chartex" xmlns:cx6="http://schemas.microsoft.com/office/drawing/2016/5/12/chartex" xmlns:cx7="http://schemas.microsoft.com/office/drawing/2016/5/13/chartex" xmlns:cx8="http://schemas.microsoft.com/office/drawing/2016/5/14/chartex" xmlns:mc="http://schemas.openxmlformats.org/markup-compatibility/2006" xmlns:aink="http://schemas.microsoft.com/office/drawing/2016/ink" xmlns:am3d="http://schemas.microsoft.com/office/drawing/2017/model3d" xmlns:o="urn:schemas-microsoft-com:office:office" xmlns:oel="http://schemas.microsoft.com/office/2019/extlst" xmlns:r="http://schemas.openxmlformats.org/officeDocument/2006/relationships" xmlns:m="http://schemas.openxmlformats.org/officeDocument/2006/math" xmlns:v="urn:schemas-microsoft-com:vml" xmlns:wp14="http://schemas.microsoft.com/office/word/2010/wordprocessingDrawing" xmlns:wp="http://schemas.openxmlformats.org/drawingml/2006/wordprocessingDrawing" xmlns:w10="urn:schemas-microsoft-com:office:word" xmlns:w="http://schemas.openxmlformats.org/wordprocessingml/2006/main" xmlns:w14="http://schemas.microsoft.com/office/word/2010/wordml" xmlns:w15="http://schemas.microsoft.com/office/word/2012/wordml" xmlns:w16cex="http://schemas.microsoft.com/office/word/2018/wordml/cex" xmlns:w16cid="http://schemas.microsoft.com/office/word/2016/wordml/cid" xmlns:w16="http://schemas.microsoft.com/office/word/2018/wordml" xmlns:w16du="http://schemas.microsoft.com/office/word/2023/wordml/word16du" xmlns:w16sdtdh="http://schemas.microsoft.com/office/word/2020/wordml/sdtdatahash" xmlns:w16sdtfl="http://schemas.microsoft.com/office/word/2024/wordml/sdtformatlock" xmlns:w16se="http://schemas.microsoft.com/office/word/2015/wordml/symex" xmlns:wpg="http://schemas.microsoft.com/office/word/2010/wordprocessingGroup" xmlns:wpi="http://schemas.microsoft.com/office/word/2010/wordprocessingInk" xmlns:wne="http://schemas.microsoft.com/office/word/2006/wordml" xmlns:wps="http://schemas.microsoft.com/office/word/2010/wordprocessingShape" mc:Ignorable="w14 w15 w16se w16cid w16 w16cex w16sdtdh w16sdtfl w16du wp14">
+<w:numbering xmlns:wpc="http://schemas.microsoft.com/office/word/2010/wordprocessingCanvas" xmlns:cx="http://schemas.microsoft.com/office/drawing/2014/chartex" xmlns:cx1="http://schemas.microsoft.com/office/drawing/2015/9/8/chartex" xmlns:cx2="http://schemas.microsoft.com/office/drawing/2015/10/21/chartex" xmlns:cx3="http://schemas.microsoft.com/office/drawing/2016/5/9/chartex" xmlns:cx4="http://schemas.microsoft.com/office/drawing/2016/5/10/chartex" xmlns:cx5="http://schemas.microsoft.com/office/drawing/2016/5/11/chartex" xmlns:cx6="http://schemas.microsoft.com/office/drawing/2016/5/12/chartex" xmlns:cx7="http://schemas.microsoft.com/office/drawing/2016/5/13/chartex" xmlns:cx8="http://schemas.microsoft.com/office/drawing/2016/5/14/chartex" xmlns:mc="http://schemas.openxmlformats.org/markup-compatibility/2006" xmlns:m="http://schemas.openxmlformats.org/officeDocument/2006/math" xmlns:aink="http://schemas.microsoft.com/office/drawing/2016/ink" xmlns:am3d="http://schemas.microsoft.com/office/drawing/2017/model3d" xmlns:oel="http://schemas.microsoft.com/office/2019/extlst" xmlns:r="http://schemas.openxmlformats.org/officeDocument/2006/relationships" xmlns:wp14="http://schemas.microsoft.com/office/word/2010/wordprocessingDrawing" xmlns:wp="http://schemas.openxmlformats.org/drawingml/2006/wordprocessingDrawing" xmlns:wpg="http://schemas.microsoft.com/office/word/2010/wordprocessingGroup" xmlns:wpi="http://schemas.microsoft.com/office/word/2010/wordprocessingInk" xmlns:wps="http://schemas.microsoft.com/office/word/2010/wordprocessingShape" xmlns:o="urn:schemas-microsoft-com:office:office" xmlns:v="urn:schemas-microsoft-com:vml" xmlns:w10="urn:schemas-microsoft-com:office:word" xmlns:w="http://schemas.openxmlformats.org/wordprocessingml/2006/main" xmlns:w14="http://schemas.microsoft.com/office/word/2010/wordml" xmlns:w15="http://schemas.microsoft.com/office/word/2012/wordml" xmlns:w16cei="http://schemas.microsoft.com/office/word/2026/wordml/cei" xmlns:w16cex="http://schemas.microsoft.com/office/word/2018/wordml/cex" xmlns:w16cid="http://schemas.microsoft.com/office/word/2016/wordml/cid" xmlns:w16="http://schemas.microsoft.com/office/word/2018/wordml" xmlns:w16sdtdh="http://schemas.microsoft.com/office/word/2020/wordml/sdtdatahash" xmlns:w16sdtfl="http://schemas.microsoft.com/office/word/2024/wordml/sdtformatlock" xmlns:w16se="http://schemas.microsoft.com/office/word/2015/wordml/symex" xmlns:w16du="http://schemas.microsoft.com/office/word/2023/wordml/word16du" xmlns:wne="http://schemas.microsoft.com/office/word/2006/wordml" mc:Ignorable="w14 w15 w16se w16cid w16 w16cex w16sdtdh w16sdtfl w16du wp14">
   <w:abstractNum w:abstractNumId="0" w15:restartNumberingAfterBreak="0">
     <w:nsid w:val="06CB51BB"/>
     <w:multiLevelType w:val="hybridMultilevel"/>
@@ -4751,7 +4703,7 @@
 </file>
 
 <file path=word/styles.xml><?xml version="1.0" encoding="utf-8"?>
-<w:styles xmlns:mc="http://schemas.openxmlformats.org/markup-compatibility/2006" xmlns:r="http://schemas.openxmlformats.org/officeDocument/2006/relationships" xmlns:w="http://schemas.openxmlformats.org/wordprocessingml/2006/main" xmlns:w14="http://schemas.microsoft.com/office/word/2010/wordml" xmlns:w15="http://schemas.microsoft.com/office/word/2012/wordml" xmlns:w16cex="http://schemas.microsoft.com/office/word/2018/wordml/cex" xmlns:w16cid="http://schemas.microsoft.com/office/word/2016/wordml/cid" xmlns:w16="http://schemas.microsoft.com/office/word/2018/wordml" xmlns:w16du="http://schemas.microsoft.com/office/word/2023/wordml/word16du" xmlns:w16sdtdh="http://schemas.microsoft.com/office/word/2020/wordml/sdtdatahash" xmlns:w16sdtfl="http://schemas.microsoft.com/office/word/2024/wordml/sdtformatlock" xmlns:w16se="http://schemas.microsoft.com/office/word/2015/wordml/symex" mc:Ignorable="w14 w15 w16se w16cid w16 w16cex w16sdtdh w16sdtfl w16du">
+<w:styles xmlns:mc="http://schemas.openxmlformats.org/markup-compatibility/2006" xmlns:r="http://schemas.openxmlformats.org/officeDocument/2006/relationships" xmlns:w="http://schemas.openxmlformats.org/wordprocessingml/2006/main" xmlns:w14="http://schemas.microsoft.com/office/word/2010/wordml" xmlns:w15="http://schemas.microsoft.com/office/word/2012/wordml" xmlns:w16cex="http://schemas.microsoft.com/office/word/2018/wordml/cex" xmlns:w16cid="http://schemas.microsoft.com/office/word/2016/wordml/cid" xmlns:w16="http://schemas.microsoft.com/office/word/2018/wordml" xmlns:w16sdtdh="http://schemas.microsoft.com/office/word/2020/wordml/sdtdatahash" xmlns:w16sdtfl="http://schemas.microsoft.com/office/word/2024/wordml/sdtformatlock" xmlns:w16se="http://schemas.microsoft.com/office/word/2015/wordml/symex" xmlns:w16du="http://schemas.microsoft.com/office/word/2023/wordml/word16du" mc:Ignorable="w14 w15 w16se w16cid w16 w16cex w16sdtdh w16sdtfl w16du">
   <w:docDefaults>
     <w:rPrDefault>
       <w:rPr>

</xml_diff>